<commit_message>
Made changes to the app and also built a simple desktop windows executable application
</commit_message>
<xml_diff>
--- a/Source_Code/Reports/Sample499/Customer Template/FindingsReportTest.docx
+++ b/Source_Code/Reports/Sample499/Customer Template/FindingsReportTest.docx
@@ -600,7 +600,7 @@
           <w14:ligatures w14:val="none"/>
         </w:rPr>
         <w:drawing>
-          <wp:anchor distT="0" distB="0" distL="114300" distR="114300" simplePos="0" relativeHeight="251662336" behindDoc="0" locked="0" layoutInCell="1" allowOverlap="1" wp14:anchorId="56FF54E8" wp14:editId="6CF77C09">
+          <wp:anchor distT="0" distB="0" distL="114300" distR="114300" simplePos="0" relativeHeight="251662336" behindDoc="0" locked="0" layoutInCell="1" allowOverlap="1" wp14:anchorId="56FF54E8" wp14:editId="6AC21126">
             <wp:simplePos x="0" y="0"/>
             <wp:positionH relativeFrom="margin">
               <wp:posOffset>1163955</wp:posOffset>
@@ -3398,7 +3398,7 @@
         <w:contextualSpacing/>
         <w:rPr>
           <w:rFonts w:ascii="Corbel" w:eastAsia="Calibri" w:hAnsi="Corbel" w:cs="Arial"/>
-          <w:color w:val="404040"/>
+          <w:color w:val="595959" w:themeColor="text1" w:themeTint="A6"/>
           <w:kern w:val="0"/>
           <w:szCs w:val="22"/>
           <w14:ligatures w14:val="none"/>
@@ -3407,6 +3407,7 @@
       <w:r>
         <w:rPr>
           <w:rFonts w:ascii="Corbel" w:hAnsi="Corbel"/>
+          <w:color w:val="595959" w:themeColor="text1" w:themeTint="A6"/>
         </w:rPr>
         <w:t xml:space="preserve">Start Date: </w:t>
       </w:r>
@@ -3421,7 +3422,7 @@
         <w:contextualSpacing/>
         <w:rPr>
           <w:rFonts w:ascii="Corbel" w:eastAsia="Calibri" w:hAnsi="Corbel" w:cs="Arial"/>
-          <w:color w:val="404040"/>
+          <w:color w:val="595959" w:themeColor="text1" w:themeTint="A6"/>
           <w:kern w:val="0"/>
           <w:szCs w:val="22"/>
           <w14:ligatures w14:val="none"/>
@@ -3430,6 +3431,7 @@
       <w:r>
         <w:rPr>
           <w:rFonts w:ascii="Corbel" w:hAnsi="Corbel"/>
+          <w:color w:val="595959" w:themeColor="text1" w:themeTint="A6"/>
         </w:rPr>
         <w:t xml:space="preserve">End Date: </w:t>
       </w:r>
@@ -3444,7 +3446,7 @@
         <w:contextualSpacing/>
         <w:rPr>
           <w:rFonts w:ascii="Corbel" w:eastAsia="Calibri" w:hAnsi="Corbel" w:cs="Arial"/>
-          <w:color w:val="F06023"/>
+          <w:color w:val="595959" w:themeColor="text1" w:themeTint="A6"/>
           <w:kern w:val="0"/>
           <w:szCs w:val="22"/>
           <w14:ligatures w14:val="none"/>
@@ -3453,6 +3455,7 @@
       <w:r>
         <w:rPr>
           <w:rFonts w:ascii="Corbel" w:hAnsi="Corbel"/>
+          <w:color w:val="595959" w:themeColor="text1" w:themeTint="A6"/>
         </w:rPr>
         <w:t xml:space="preserve">Escalation Contact: </w:t>
       </w:r>
@@ -3602,7 +3605,6 @@
           <w:kern w:val="0"/>
           <w:sz w:val="20"/>
           <w:szCs w:val="20"/>
-          <w:highlight w:val="yellow"/>
           <w14:ligatures w14:val="none"/>
         </w:rPr>
         <w:t>INTERNAL NETWORK ASSESSMENT</w:t>
@@ -4121,7 +4123,6 @@
           <w:kern w:val="0"/>
           <w:sz w:val="44"/>
           <w:szCs w:val="32"/>
-          <w:highlight w:val="cyan"/>
           <w14:ligatures w14:val="none"/>
         </w:rPr>
       </w:pPr>
@@ -4135,7 +4136,6 @@
           <w:kern w:val="0"/>
           <w:sz w:val="44"/>
           <w:szCs w:val="32"/>
-          <w:highlight w:val="cyan"/>
           <w14:ligatures w14:val="none"/>
         </w:rPr>
         <w:lastRenderedPageBreak/>
@@ -4169,7 +4169,6 @@
           <w:kern w:val="0"/>
           <w:sz w:val="32"/>
           <w:szCs w:val="26"/>
-          <w:highlight w:val="cyan"/>
           <w14:ligatures w14:val="none"/>
         </w:rPr>
         <w:t>Executive Overview</w:t>
@@ -4773,7 +4772,6 @@
           <w:kern w:val="0"/>
           <w:sz w:val="32"/>
           <w:szCs w:val="26"/>
-          <w:highlight w:val="yellow"/>
           <w14:ligatures w14:val="none"/>
         </w:rPr>
         <w:lastRenderedPageBreak/>
@@ -4890,7 +4888,6 @@
           <w:color w:val="404040"/>
           <w:kern w:val="0"/>
           <w:szCs w:val="22"/>
-          <w:highlight w:val="yellow"/>
           <w14:ligatures w14:val="none"/>
         </w:rPr>
         <w:t>NUMBER (#)</w:t>
@@ -4966,7 +4963,6 @@
           <w:color w:val="404040"/>
           <w:kern w:val="0"/>
           <w:szCs w:val="22"/>
-          <w:highlight w:val="yellow"/>
           <w14:ligatures w14:val="none"/>
         </w:rPr>
         <w:t>DOPPELGANGER DOMAINS TABLE</w:t>
@@ -5059,7 +5055,6 @@
           <w:color w:val="404040"/>
           <w:kern w:val="0"/>
           <w:szCs w:val="22"/>
-          <w:highlight w:val="yellow"/>
           <w14:ligatures w14:val="none"/>
         </w:rPr>
         <w:t>SUB DOMAIN TABLE</w:t>
@@ -5115,7 +5110,6 @@
           <w:color w:val="404040"/>
           <w:kern w:val="0"/>
           <w:szCs w:val="22"/>
-          <w:highlight w:val="yellow"/>
           <w14:ligatures w14:val="none"/>
         </w:rPr>
         <w:t>DNS RECORD(S) TABLE</w:t>
@@ -5200,17 +5194,15 @@
           <w:kern w:val="0"/>
           <w:sz w:val="18"/>
           <w:szCs w:val="18"/>
-          <w:lang w:val="fr-FR"/>
-          <w14:ligatures w14:val="none"/>
-        </w:rPr>
-      </w:pPr>
-      <w:r>
-        <w:rPr>
-          <w:rFonts w:ascii="Corbel" w:eastAsia="Calibri" w:hAnsi="Corbel" w:cs="Arial"/>
-          <w:color w:val="404040"/>
-          <w:kern w:val="0"/>
-          <w:szCs w:val="22"/>
-          <w:lang w:val="fr-FR"/>
+          <w14:ligatures w14:val="none"/>
+        </w:rPr>
+      </w:pPr>
+      <w:r>
+        <w:rPr>
+          <w:rFonts w:ascii="Corbel" w:eastAsia="Calibri" w:hAnsi="Corbel" w:cs="Arial"/>
+          <w:color w:val="404040"/>
+          <w:kern w:val="0"/>
+          <w:szCs w:val="22"/>
           <w14:ligatures w14:val="none"/>
         </w:rPr>
         <w:br w:type="page"/>
@@ -5424,7 +5416,7 @@
           <w14:ligatures w14:val="none"/>
         </w:rPr>
         <w:drawing>
-          <wp:inline distT="0" distB="0" distL="0" distR="0" wp14:anchorId="03962334" wp14:editId="4DC07FE6">
+          <wp:inline distT="0" distB="0" distL="0" distR="0" wp14:anchorId="03962334" wp14:editId="206F5950">
             <wp:extent cx="152400" cy="152400"/>
             <wp:effectExtent l="0" t="0" r="0" b="0"/>
             <wp:docPr id="2011428596" name="Picture 2011428596" descr="Fire with solid fill"/>
@@ -5959,6 +5951,7 @@
           <w:docPartUnique/>
         </w:docPartObj>
       </w:sdtPr>
+      <w:sdtEndPr/>
       <w:sdtContent>
         <w:r>
           <w:rPr>
@@ -8728,7 +8721,7 @@
   <w:style w:type="paragraph" w:default="1" w:styleId="Normal">
     <w:name w:val="Normal"/>
     <w:qFormat/>
-    <w:rsid w:val="0055075A"/>
+    <w:rsid w:val="00CB376D"/>
   </w:style>
   <w:style w:type="paragraph" w:styleId="Heading1">
     <w:name w:val="heading 1"/>
@@ -9356,7 +9349,7 @@
     <w:basedOn w:val="Normal"/>
     <w:uiPriority w:val="99"/>
     <w:unhideWhenUsed/>
-    <w:rsid w:val="001F008D"/>
+    <w:rsid w:val="00CB376D"/>
     <w:pPr>
       <w:numPr>
         <w:numId w:val="23"/>
@@ -9366,6 +9359,7 @@
     </w:pPr>
     <w:rPr>
       <w:rFonts w:ascii="Corbel" w:hAnsi="Corbel"/>
+      <w:color w:val="595959" w:themeColor="text1" w:themeTint="A6"/>
     </w:rPr>
   </w:style>
   <w:style w:type="paragraph" w:styleId="ListNumber3">

</xml_diff>